<commit_message>
Informe Sentinel: nota de liveness de IOCs en Anexo A (chequeo pasivo 20/10/2026)
</commit_message>
<xml_diff>
--- a/Plantilla Informe Threat Hunting - ClickFix RunMRU - Sentinel (ES).docx
+++ b/Plantilla Informe Threat Hunting - ClickFix RunMRU - Sentinel (ES).docx
@@ -11248,7 +11248,57 @@
           <w:szCs w:val="18"/>
           <w:rtl w:val="0"/>
         </w:rPr>
-        <w:t xml:space="preserve">Los indicadores de red pertenecen a la infraestructura del atacante y tienen vida corta: el servidor del MSI dejó de responder al día siguiente. Además, el servidor genera un 511.ps1 distinto en cada descarga, así que sus hashes tampoco sirven como base de detección. Usalos para bloqueo y búsqueda retroactiva.</w:t>
+        <w:t xml:space="preserve">Los indicadores de red pertenecen a la infraestructura del atacante y tienen vida corta: el servidor del MSI dejó de responder al día siguiente. Además, el servidor genera un 511.ps1 distinto en cada descarga, así que sus hashes tampoco sirven como base de detección. Usalos para bloqueo y búsqueda retroactiva. </w:t>
+      </w:r>
+      <w:r>
+        <w:rPr>
+          <w:rFonts w:ascii="Arial" w:cs="Arial" w:eastAsia="Arial" w:hAnsi="Arial"/>
+          <w:b w:val="1"/>
+          <w:bCs w:val="1"/>
+          <w:i w:val="1"/>
+          <w:iCs w:val="1"/>
+          <w:color w:val="666666"/>
+          <w:sz w:val="18"/>
+          <w:szCs w:val="18"/>
+          <w:rtl w:val="0"/>
+        </w:rPr>
+        <w:t xml:space="preserve">Liveness de IOCs (chequeo pasivo, 20/10/2026 · VirusTotal y urlscan.io):</w:t>
+      </w:r>
+      <w:r>
+        <w:rPr>
+          <w:rFonts w:ascii="Arial" w:cs="Arial" w:eastAsia="Arial" w:hAnsi="Arial"/>
+          <w:i w:val="1"/>
+          <w:iCs w:val="1"/>
+          <w:color w:val="666666"/>
+          <w:sz w:val="18"/>
+          <w:szCs w:val="18"/>
+          <w:rtl w:val="0"/>
+        </w:rPr>
+        <w:t xml:space="preserve"> el host del MSI 86.109.75.7 (GorillaServers, US) sigue sin actividad en la web pública desde el incidente pero conserva reputación maliciosa (14/92); la segunda IP, 31.56.19.29 (AS Blatant, AE), seguía viva ocho días atrás (7/92); el dominio smashshape.com responde con un 403 detrás de Cloudflare (11/92, sin clasificación en Google Safe Browsing); y el MSI mantiene 10/61 con la etiqueta </w:t>
+      </w:r>
+      <w:r>
+        <w:rPr>
+          <w:rFonts w:ascii="Arial" w:cs="Arial" w:eastAsia="Arial" w:hAnsi="Arial"/>
+          <w:i w:val="1"/>
+          <w:iCs w:val="1"/>
+          <w:color w:val="188038"/>
+          <w:sz w:val="18"/>
+          <w:szCs w:val="18"/>
+          <w:rtl w:val="0"/>
+        </w:rPr>
+        <w:t xml:space="preserve">trojan.eignyl/loader</w:t>
+      </w:r>
+      <w:r>
+        <w:rPr>
+          <w:rFonts w:ascii="Arial" w:cs="Arial" w:eastAsia="Arial" w:hAnsi="Arial"/>
+          <w:i w:val="1"/>
+          <w:iCs w:val="1"/>
+          <w:color w:val="666666"/>
+          <w:sz w:val="18"/>
+          <w:szCs w:val="18"/>
+          <w:rtl w:val="0"/>
+        </w:rPr>
+        <w:t xml:space="preserve">. La detección sigue siendo parcial y desfasada: es el argumento de por qué la caza se sostiene sobre el comportamiento y no sobre estos indicadores.</w:t>
       </w:r>
     </w:p>
     <w:p>

</xml_diff>